<commit_message>
Clarify manuscript prose and close equation attribution gaps
</commit_message>
<xml_diff>
--- a/TopoFlow_IEEE_V4_Cited_Revised.docx
+++ b/TopoFlow_IEEE_V4_Cited_Revised.docx
@@ -228,7 +228,7 @@
           <w:sz w:val="18"/>
           <w:lang w:val="en-IN"/>
         </w:rPr>
-        <w:t>A separate frozen evaluation on ten crops from five previously unused scans tests geometry-only critical-throat selection. Individually restricting GAT-selected throats by 50% yields mean permeability loss of 3.57%, versus 0.37% for random selection and 4.08% for an affine-pressure ranking. GAT response MAE is 2.04 percentage points, versus 0.46 for no response. These results distinguish useful ranking information from accurate response prediction and delimit the benefit of attention under the stated PNM reference.</w:t>
+        <w:t>A separate frozen evaluation on ten crops from five previously unused scans tests geometry-only critical-throat selection. Individually restricting GAT-selected throats by 50% yields mean permeability loss of 3.57%, versus 0.37% for random selection and 4.08% for an affine-pressure ranking. GAT response MAE is 2.04 percentage points, versus 0.46 for no response. GAT identified more consequential throats than random selection, but affine-pressure ranking performed better overall and response magnitudes remained poorly calibrated.</w:t>
       </w:r>
     </w:p>
     <w:p>
@@ -349,7 +349,7 @@
           <w:i w:val="0"/>
           <w:sz w:val="20"/>
         </w:rPr>
-        <w:t>Graph representations provide another route by processing extracted pores and their connections. They avoid propagating features through every solid voxel, although network extraction still incurs a measurable cost. Whether this representation improves accuracy or runtime must be established against analytical, descriptor-based and network-solver baselines on the same task.</w:t>
+        <w:t>Graph representations process extracted pores and their connections, avoiding feature propagation through every solid voxel. Network extraction still incurs a measurable cost. We compare prediction accuracy and computational cost with analytical relations, descriptor models and the reference network solver.</w:t>
       </w:r>
     </w:p>
     <w:p>
@@ -559,7 +559,7 @@
           <w:i w:val="0"/>
           <w:sz w:val="20"/>
         </w:rPr>
-        <w:t>Chapuis and Aubertin discuss the applicability of KC to soil hydraulic conductivity [5]. Such relations do not explicitly resolve individual flow paths, but their performance depends on how scale and calibration are specified. We evaluate both a calibrated porosity relation and a diameter-scaled variant rather than assuming that graph learning must outperform them.</w:t>
+        <w:t>Chapuis and Aubertin discuss the applicability of KC to soil hydraulic conductivity [5]. Such relations do not explicitly resolve individual flow paths, and their performance depends on the chosen scale and calibration. We evaluate a calibrated porosity relation and a diameter-scaled variant.</w:t>
       </w:r>
     </w:p>
     <w:p>
@@ -767,7 +767,7 @@
           <w:rFonts w:ascii="Times New Roman" w:hAnsi="Times New Roman"/>
           <w:sz w:val="20"/>
         </w:rPr>
-        <w:t xml:space="preserve"> LBM advances discrete particle distributions on a lattice and can resolve voxel-scale flow. It provides useful context for digital-rock permeability prediction, but no LBM labels are generated in the present experiments. Its collision and streaming update can be written as</w:t>
+        <w:t xml:space="preserve"> LBM advances discrete particle distributions on a lattice and can resolve voxel-scale flow. No LBM labels are generated in the present experiments. For background, we use the lattice-BGK formulation of Qian et al. [6].</w:t>
       </w:r>
     </w:p>
     <w:p>
@@ -787,7 +787,7 @@
           <w:i w:val="0"/>
           <w:sz w:val="20"/>
         </w:rPr>
-        <w:t>the following single-relaxation-time expression:</w:t>
+        <w:t>Its single-relaxation-time update is</w:t>
       </w:r>
     </w:p>
     <w:p>
@@ -1193,7 +1193,7 @@
           <w:rFonts w:ascii="Times New Roman" w:hAnsi="Times New Roman"/>
           <w:sz w:val="20"/>
         </w:rPr>
-        <w:t xml:space="preserve"> Pore-GNN predicts flow properties from micro-CT-derived graphs [6]. RTG-GNN incorporates pore and throat information with gating and attention [7]. I’Anson et al. evaluate graph permeability prediction against LBM labels and include extraction cost in their assessment [8]. Thus, graph extraction, attention and simulation-trained permeability prediction are established approaches.</w:t>
+        <w:t xml:space="preserve"> Pore-GNN combines CNN-derived image features with graph models for permeability prediction [7]. These feature graphs differ from physical pore–throat networks. RTG-GNN incorporates pore and throat information with gating and attention [8]. I’Anson et al. evaluate graph permeability prediction against LBM labels and include extraction cost in their assessment [9]. Graph-based permeability prediction therefore has several established representations and training approaches.</w:t>
       </w:r>
     </w:p>
     <w:p>
@@ -1212,7 +1212,7 @@
           <w:i w:val="0"/>
           <w:sz w:val="20"/>
         </w:rPr>
-        <w:t>Zhao and Xiao embed learned conductances in a differentiable PNM [9]. Building on established graph-based permeability prediction, our comparison focuses on source-scan transfer, the separate effects of scale and descriptors, and geometry-only selection of influential throats under a fixed hydraulic closure.</w:t>
+        <w:t>Zhao and Xiao embed learned conductances in a differentiable PNM [10]. Building on established graph-based permeability prediction, our comparison focuses on source-scan transfer, the separate effects of scale and descriptors, and geometry-only selection of influential throats under a fixed hydraulic closure.</w:t>
       </w:r>
     </w:p>
     <w:p>
@@ -1624,7 +1624,7 @@
                 <w:b w:val="0"/>
                 <w:sz w:val="16"/>
               </w:rPr>
-              <w:t>GNN [6]–[9]</w:t>
+              <w:t>GNN [7]–[10]</w:t>
             </w:r>
           </w:p>
         </w:tc>
@@ -1651,7 +1651,7 @@
                 <w:b w:val="0"/>
                 <w:sz w:val="16"/>
               </w:rPr>
-              <w:t>Pore network</w:t>
+              <w:t>Graph representations</w:t>
             </w:r>
           </w:p>
         </w:tc>
@@ -1678,7 +1678,7 @@
                 <w:b w:val="0"/>
                 <w:sz w:val="16"/>
               </w:rPr>
-              <w:t>Established approach; source transfer and restrictions tested here</w:t>
+              <w:t>CNN feature graphs or pore–throat graphs; transfer and restrictions tested here</w:t>
             </w:r>
           </w:p>
         </w:tc>
@@ -1889,7 +1889,7 @@
           <w:iCs/>
           <w:sz w:val="20"/>
         </w:rPr>
-        <w:t>1) Image input: Natural-rock binary volumes come from the Imperial College collection [10] and the separate Estaillades archive [11]. Fixed 128³-voxel crops retain the physical voxel size from source metadata. Pore space is encoded by zero. Source-byte checks verify crop provenance and exclude duplicate test crops.</w:t>
+        <w:t>1) Image input: Natural-rock binary volumes come from the Imperial College collection [11] and the separate Estaillades archive [12]. Fixed 128³-voxel crops retain the physical voxel size from source metadata. Pore space is encoded by zero. Source-byte checks verify crop provenance and exclude duplicate test crops.</w:t>
       </w:r>
     </w:p>
     <w:p>
@@ -1913,7 +1913,7 @@
           <w:iCs/>
           <w:sz w:val="20"/>
         </w:rPr>
-        <w:t>2) Network extraction: SNOW2 partitions the void space using watershed regions [12]. Pore bodies form vertices and connecting throats form edges. The fixed settings are sigma 0.4, maximum radius 4, boundary width (3,0,0) voxels and one extraction division. Geometry is converted to physical units before the hydraulic reference is calculated.</w:t>
+        <w:t>2) Network extraction: SNOW2 partitions the void space using watershed regions [13]. Pore bodies form vertices and connecting throats form edges. The fixed settings are sigma 0.4, maximum radius 4, boundary width (3,0,0) voxels and one extraction division. Geometry is converted to physical units before the hydraulic reference is calculated.</w:t>
       </w:r>
     </w:p>
     <w:p>
@@ -2026,7 +2026,7 @@
           <w:rFonts w:ascii="Times New Roman" w:hAnsi="Times New Roman"/>
           <w:sz w:val="20"/>
         </w:rPr>
-        <w:t xml:space="preserve"> The bulk model uses graph attention [13]. Its first layer has two 64-channel heads, giving 128 channels; the next two have one 64-channel head each. ELU and dropout follow each layer. Global mean pooling feeds a 64→32→1 MLP with ReLU and dropout. The original bulk encoder does not receive throat features.</w:t>
+        <w:t xml:space="preserve"> The bulk model uses graph attention [14]. Its first layer has two 64-channel heads, giving 128 channels; the next two have one 64-channel head each. ELU and dropout follow each layer. Global mean pooling feeds a 64→32→1 MLP with ReLU and dropout. The original bulk encoder does not receive throat features.</w:t>
       </w:r>
     </w:p>
     <w:p>
@@ -2726,7 +2726,7 @@
           <w:i w:val="0"/>
           <w:sz w:val="20"/>
         </w:rPr>
-        <w:t>The coefficients α are softmax-normalized over the neighbors and self-loop of pore v. Scores use a learned vector applied to concatenated transformed endpoint embeddings followed by LeakyReLU [13]. The two first-layer heads are concatenated. This local attention is distinct from the separately trained global throat-importance head used in the restriction experiment.</w:t>
+        <w:t>The coefficients α are softmax-normalized over the neighbors and self-loop of pore v. Scores use a learned vector applied to concatenated transformed endpoint embeddings followed by LeakyReLU [14]. The two first-layer heads are concatenated. This local attention is distinct from the separately trained global throat-importance head used in the restriction experiment.</w:t>
       </w:r>
     </w:p>
     <w:p>
@@ -4417,7 +4417,7 @@
           <w:sz w:val="20"/>
           <w:lang w:val="en-US"/>
         </w:rPr>
-        <w:t>5) Restriction extension: A separate edge-aware model trains on eight development crops, two per parent. Seven node features add normalized coordinates and inlet/outlet flags; six edge features encode normalized diameter, length, a d⁴/L proxy and absolute direction components. Three 32-channel GAT layers feed a symmetric 70→32→2 edge head. A global softmax predicts importance s, and a sigmoid gives leverage ℓ bounded by 1−s. For diameter reduction q, the conductance multiplier is r=(1−q)⁴. The fractional permeability-loss readout below constrains the output but does not ensure hydraulic accuracy:</w:t>
+        <w:t>5) Restriction extension: A separate edge-aware model trains on eight development crops, two per parent. Seven node features add normalized coordinates and inlet/outlet flags; six edge features encode normalized diameter, length, a d⁴/L proxy and absolute direction components. Three 32-channel GAT layers feed a symmetric 70→32→2 edge head. A global softmax predicts importance s, and a sigmoid gives leverage ℓ bounded by 1−s. For diameter reduction q, the conductance multiplier is r=(1−q)⁴. Changing one conductance gives a rank-one update of the linear network equations. The Sherman–Morrison identity [15] yields the loss expression below when s and ℓ are the exact dissipation fraction and edge leverage. The GAT substitutes learned estimates; their accuracy determines response calibration. A derivation accompanies the source implementation:</w:t>
       </w:r>
     </w:p>
     <w:p>
@@ -6104,7 +6104,7 @@
           <w:i w:val="0"/>
           <w:sz w:val="20"/>
         </w:rPr>
-        <w:t>Sixteen independently assembled, identical-conductance OpenPNM checks agree with the sparse reference to a maximum relative permeability difference of 2.1×10⁻¹⁴. This verifies numerical implementation. On supplied original S1/S5 maximal-ball networks, a Valvatne–Blunt shape-factor closure [14] differs from published network permeability by 12.5% and 33.5%. Closure, reservoir-boundary treatment and flow-axis differences remain material.</w:t>
+        <w:t>Sixteen independently assembled, identical-conductance OpenPNM checks agree with the sparse reference to a maximum relative permeability difference of 2.1×10⁻¹⁴. This verifies numerical implementation. On supplied original S1/S5 maximal-ball networks, a Valvatne–Blunt shape-factor closure [16] differs from published network permeability by 12.5% and 33.5%. Closure, reservoir-boundary treatment and flow-axis differences remain material.</w:t>
       </w:r>
     </w:p>
     <w:p>
@@ -6123,7 +6123,7 @@
           <w:i w:val="0"/>
           <w:sz w:val="20"/>
         </w:rPr>
-        <w:t>Full-volume SNOW calculations give 342.49 and 1187.48 mD for S1 and S5, versus published image Kz values 1312 and 4440 mD. The original-network checks do not reconcile that gap. PNM target uncertainty is therefore distinct from learning error, and the restriction results remain conditional on cylindrical inscribed-diameter throats. Location-dependent clogging has prior pore-scale treatments [15]; these fixed-network interventions do not simulate evolving deposits.</w:t>
+        <w:t>Full-volume SNOW calculations give 342.49 and 1187.48 mD for S1 and S5, versus published image Kz values 1312 and 4440 mD. The original-network checks do not reconcile that gap. PNM target uncertainty is therefore distinct from learning error, and the restriction results remain conditional on cylindrical inscribed-diameter throats. Location-dependent clogging has prior pore-scale treatments [17]; these fixed-network interventions do not simulate evolving deposits.</w:t>
       </w:r>
     </w:p>
     <w:p>
@@ -6198,7 +6198,7 @@
           <w:sz w:val="20"/>
           <w:szCs w:val="18"/>
         </w:rPr>
-        <w:t>Independent voxel-resolved flow or measured permeability on source-separated specimens is the next validation target. The current experiments establish behavior relative to a declared PNM. They do not validate physical clogging, multiphase transport or field-scale permeability.</w:t>
+        <w:t>Independent voxel-resolved flow or measured permeability is needed to assess physical accuracy beyond the present PNM reference. This validation should use specimens from sources excluded from model development.</w:t>
       </w:r>
     </w:p>
     <w:p>
@@ -6217,45 +6217,7 @@
           <w:i w:val="0"/>
           <w:sz w:val="20"/>
         </w:rPr>
-        <w:t>Broader source coverage would permit testing the exploratory geometry associations and assessing calibration without reusing the inspected scans. An extraction-sensitivity study should vary segmentation, watershed settings, voxel resolution and hydraulic closure under a fixed evaluation protocol.</w:t>
-      </w:r>
-    </w:p>
-    <w:p>
-      <w:pPr>
-        <w:spacing w:line="240" w:lineRule="auto" w:before="0" w:after="80"/>
-        <w:ind w:firstLine="200"/>
-        <w:jc w:val="both"/>
-        <w:numPr>
-          <w:numId w:val="0"/>
-        </w:numPr>
-      </w:pPr>
-      <w:r>
-        <w:rPr>
-          <w:rFonts w:ascii="Times New Roman" w:hAnsi="Times New Roman"/>
-          <w:b w:val="0"/>
-          <w:i w:val="0"/>
-          <w:sz w:val="20"/>
-        </w:rPr>
-        <w:t>Model development should address the measured calibration error and compare its cost with exact network updates. New response calibration or a geometry-based model selector requires fresh validation; the post-hoc five-scan associations cannot serve as their test set.</w:t>
-      </w:r>
-    </w:p>
-    <w:p>
-      <w:pPr>
-        <w:spacing w:line="240" w:lineRule="auto" w:before="0" w:after="80"/>
-        <w:ind w:firstLine="200"/>
-        <w:jc w:val="both"/>
-        <w:numPr>
-          <w:numId w:val="0"/>
-        </w:numPr>
-      </w:pPr>
-      <w:r>
-        <w:rPr>
-          <w:rFonts w:ascii="Times New Roman" w:hAnsi="Times New Roman"/>
-          <w:b w:val="0"/>
-          <w:i w:val="0"/>
-          <w:sz w:val="20"/>
-        </w:rPr>
-        <w:t>These extensions retain the existing SNOW2-to-graph workflow while targeting its principal unresolved errors.</w:t>
+        <w:t>Further work should test segmentation and extraction settings, voxel resolution and conductance closures under a fixed evaluation protocol. Broader source coverage is also needed to test the exploratory topology associations and evaluate response calibration or a geometry-based model selector on fresh scans.</w:t>
       </w:r>
     </w:p>
     <w:p>
@@ -6297,7 +6259,7 @@
           <w:sz w:val="20"/>
           <w:lang w:val="x-none" w:eastAsia="x-none"/>
         </w:rPr>
-        <w:t>TopoFlow predicts PNM permeability from SNOW2-extracted pore networks using graph attention. Source-separated experiments show that scale normalization and graph descriptors improve the original GAT, but simpler controls remain stronger: external log-RMSE is 0.569 for the primary GAT and 0.253 for physics ridge. Millisecond graph forwarding is observed after extraction, without a demonstrated end-to-end speed advantage.</w:t>
+        <w:t>TopoFlow combines SNOW2 pore networks with graph attention for PNM permeability regression. Scale normalization and graph descriptors improved development performance, but physics ridge remained stronger on the locked external test: log-RMSE was 0.253, compared with 0.569 for the primary GAT.</w:t>
       </w:r>
     </w:p>
     <w:p>
@@ -6316,7 +6278,7 @@
           <w:i w:val="0"/>
           <w:sz w:val="20"/>
         </w:rPr>
-        <w:t>The frozen restriction study finds useful geometry-driven throat ranking relative to random selection, while affine pressure ranks more consequential throats in aggregate and the guided GAT overestimates response magnitude. The completed evidence supports a comparative assessment of representation, transfer and calibration under a fixed PNM closure. Numerical solver agreement does not resolve the remaining physical-reference uncertainty.</w:t>
+        <w:t>The throat-aware GAT identified more consequential restrictions than random selection, while affine-pressure ranking gave the larger aggregate loss. Its response predictions overestimated the reference PNM losses. These findings show that useful throat ranking does not ensure accurate response calibration.</w:t>
       </w:r>
     </w:p>
     <w:p>
@@ -6338,6 +6300,7 @@
     </w:p>
     <w:p>
       <w:pPr>
+        <w:keepLines/>
         <w:spacing w:after="80" w:line="240" w:lineRule="auto"/>
         <w:ind w:left="240" w:hanging="240"/>
         <w:jc w:val="left"/>
@@ -6353,6 +6316,7 @@
     </w:p>
     <w:p>
       <w:pPr>
+        <w:keepLines/>
         <w:spacing w:after="80" w:line="240" w:lineRule="auto"/>
         <w:ind w:left="240" w:hanging="240"/>
         <w:jc w:val="left"/>
@@ -6368,6 +6332,7 @@
     </w:p>
     <w:p>
       <w:pPr>
+        <w:keepLines/>
         <w:spacing w:after="80" w:line="240" w:lineRule="auto"/>
         <w:ind w:left="240" w:hanging="240"/>
         <w:jc w:val="left"/>
@@ -6383,6 +6348,7 @@
     </w:p>
     <w:p>
       <w:pPr>
+        <w:keepLines/>
         <w:spacing w:after="80" w:line="240" w:lineRule="auto"/>
         <w:ind w:left="240" w:hanging="240"/>
         <w:jc w:val="left"/>
@@ -6398,6 +6364,7 @@
     </w:p>
     <w:p>
       <w:pPr>
+        <w:keepLines/>
         <w:spacing w:after="80" w:line="240" w:lineRule="auto"/>
         <w:ind w:left="240" w:hanging="240"/>
         <w:jc w:val="left"/>
@@ -6413,6 +6380,7 @@
     </w:p>
     <w:p>
       <w:pPr>
+        <w:keepLines/>
         <w:spacing w:after="80" w:line="240" w:lineRule="auto"/>
         <w:ind w:left="240" w:hanging="240"/>
         <w:jc w:val="left"/>
@@ -6423,11 +6391,12 @@
           <w:i w:val="0"/>
           <w:sz w:val="16"/>
         </w:rPr>
-        <w:t>[6] M. K. Alzahrani, A. Shapoval, Z. Chen et al., “Pore-GNN: A graph neural network-based framework for predicting flow properties of porous media from micro-CT images,” Advances in Geo-Energy Research, vol. 10, no. 1, pp. 39–55, 2023, doi: 10.46690/ager.2023.10.05.</w:t>
-      </w:r>
-    </w:p>
-    <w:p>
-      <w:pPr>
+        <w:t>[6] Y. H. Qian, D. d’Humières and P. Lallemand, “Lattice BGK models for Navier–Stokes equation,” Europhysics Letters, vol. 17, no. 6, pp. 479–484, 1992, doi: 10.1209/0295-5075/17/6/001.</w:t>
+      </w:r>
+    </w:p>
+    <w:p>
+      <w:pPr>
+        <w:keepLines/>
         <w:spacing w:after="80" w:line="240" w:lineRule="auto"/>
         <w:ind w:left="240" w:hanging="240"/>
         <w:jc w:val="left"/>
@@ -6438,11 +6407,12 @@
           <w:i w:val="0"/>
           <w:sz w:val="16"/>
         </w:rPr>
-        <w:t>[7] X. Zhao, Y. Zhong and P. Li, “RTG-GNN: A novel rock topology-guided approach for permeability prediction using graph neural networks,” Geoenergy Science and Engineering, vol. 243, 213358, 2024, doi: 10.1016/j.geoen.2024.213358.</w:t>
-      </w:r>
-    </w:p>
-    <w:p>
-      <w:pPr>
+        <w:t>[7] M. K. Alzahrani, A. Shapoval, Z. Chen et al., “Pore-GNN: A graph neural network-based framework for predicting flow properties of porous media from micro-CT images,” Advances in Geo-Energy Research, vol. 10, no. 1, pp. 39–55, 2023, doi: 10.46690/ager.2023.10.05.</w:t>
+      </w:r>
+    </w:p>
+    <w:p>
+      <w:pPr>
+        <w:keepLines/>
         <w:spacing w:after="80" w:line="240" w:lineRule="auto"/>
         <w:ind w:left="240" w:hanging="240"/>
         <w:jc w:val="left"/>
@@ -6453,11 +6423,12 @@
           <w:i w:val="0"/>
           <w:sz w:val="16"/>
         </w:rPr>
-        <w:t>[8] J. M. I’Anson, M. J. H. Simmons, E. H. Stitt and R. W. Gallen, “Using graph neural networks to predict the permeability of porous media,” InterPore Journal, vol. 2, no. 3, 2025, doi: 10.69631/ipj.v2i3nr47.</w:t>
-      </w:r>
-    </w:p>
-    <w:p>
-      <w:pPr>
+        <w:t>[8] X. Zhao, Y. Zhong and P. Li, “RTG-GNN: A novel rock topology-guided approach for permeability prediction using graph neural networks,” Geoenergy Science and Engineering, vol. 243, 213358, 2024, doi: 10.1016/j.geoen.2024.213358.</w:t>
+      </w:r>
+    </w:p>
+    <w:p>
+      <w:pPr>
+        <w:keepLines/>
         <w:spacing w:after="80" w:line="240" w:lineRule="auto"/>
         <w:ind w:left="240" w:hanging="240"/>
         <w:jc w:val="left"/>
@@ -6468,11 +6439,12 @@
           <w:i w:val="0"/>
           <w:sz w:val="16"/>
         </w:rPr>
-        <w:t>[9] Q. Zhao and H. Xiao, “An end-to-end differentiable, graph neural network-embedded pore network model for permeability prediction,” Journal of Hydrology, vol. 675, 135602, 2026, doi: 10.1016/j.jhydrol.2026.135602.</w:t>
-      </w:r>
-    </w:p>
-    <w:p>
-      <w:pPr>
+        <w:t>[9] J. M. I’Anson, M. J. H. Simmons, E. H. Stitt and R. W. Gallen, “Using graph neural networks to predict the permeability of porous media,” InterPore Journal, vol. 2, no. 3, 2025, doi: 10.69631/ipj.v2i3nr47.</w:t>
+      </w:r>
+    </w:p>
+    <w:p>
+      <w:pPr>
+        <w:keepLines/>
         <w:spacing w:after="80" w:line="240" w:lineRule="auto"/>
         <w:ind w:left="240" w:hanging="240"/>
         <w:jc w:val="left"/>
@@ -6483,11 +6455,12 @@
           <w:i w:val="0"/>
           <w:sz w:val="16"/>
         </w:rPr>
-        <w:t>[10] Imperial College London, Pore-scale Modelling Group, “ImagesICPSC2007,” binary images and source headers. Accessed Oct. 22, 2026. Available: https://imperialcollegelondon.box.com/v/ImagesICPSC2007.</w:t>
-      </w:r>
-    </w:p>
-    <w:p>
-      <w:pPr>
+        <w:t>[10] Q. Zhao and H. Xiao, “An end-to-end differentiable, graph neural network-embedded pore network model for permeability prediction,” Journal of Hydrology, vol. 675, 135602, 2026, doi: 10.1016/j.jhydrol.2026.135602.</w:t>
+      </w:r>
+    </w:p>
+    <w:p>
+      <w:pPr>
+        <w:keepLines/>
         <w:spacing w:after="80" w:line="240" w:lineRule="auto"/>
         <w:ind w:left="240" w:hanging="240"/>
         <w:jc w:val="left"/>
@@ -6498,11 +6471,12 @@
           <w:i w:val="0"/>
           <w:sz w:val="16"/>
         </w:rPr>
-        <w:t>[11] Imperial College London, “Estaillades 1000³ micro-CT image, 3.31136 μm.” Accessed Oct. 22, 2026. Official archive: https://imperialcollegelondon.box.com/shared/static/2n4lb95amz7fstk19q826uzu922eb4b1.zip.</w:t>
-      </w:r>
-    </w:p>
-    <w:p>
-      <w:pPr>
+        <w:t>[11] Imperial College London, Pore-scale Modelling Group, “ImagesICPSC2007,” binary images and source headers. Accessed Oct. 22, 2026. Available: https://imperialcollegelondon.box.com/v/ImagesICPSC2007.</w:t>
+      </w:r>
+    </w:p>
+    <w:p>
+      <w:pPr>
+        <w:keepLines/>
         <w:spacing w:after="80" w:line="240" w:lineRule="auto"/>
         <w:ind w:left="240" w:hanging="240"/>
         <w:jc w:val="left"/>
@@ -6513,11 +6487,12 @@
           <w:i w:val="0"/>
           <w:sz w:val="16"/>
         </w:rPr>
-        <w:t>[12] J. T. Gostick, “Versatile and efficient pore network extraction method using marker-based watershed segmentation,” Physical Review E, vol. 96, 023307, 2017, doi: 10.1103/PhysRevE.96.023307.</w:t>
-      </w:r>
-    </w:p>
-    <w:p>
-      <w:pPr>
+        <w:t>[12] Imperial College London, “Estaillades 1000³ micro-CT image, 3.31136 μm.” Accessed Oct. 22, 2026. Official archive: https://imperialcollegelondon.box.com/shared/static/2n4lb95amz7fstk19q826uzu922eb4b1.zip.</w:t>
+      </w:r>
+    </w:p>
+    <w:p>
+      <w:pPr>
+        <w:keepLines/>
         <w:spacing w:after="80" w:line="240" w:lineRule="auto"/>
         <w:ind w:left="240" w:hanging="240"/>
         <w:jc w:val="left"/>
@@ -6528,11 +6503,12 @@
           <w:i w:val="0"/>
           <w:sz w:val="16"/>
         </w:rPr>
-        <w:t>[13] P. Veličković et al., “Graph Attention Networks,” International Conference on Learning Representations, 2018, arXiv:1710.10903.</w:t>
-      </w:r>
-    </w:p>
-    <w:p>
-      <w:pPr>
+        <w:t>[13] J. T. Gostick, “Versatile and efficient pore network extraction method using marker-based watershed segmentation,” Physical Review E, vol. 96, 023307, 2017, doi: 10.1103/PhysRevE.96.023307.</w:t>
+      </w:r>
+    </w:p>
+    <w:p>
+      <w:pPr>
+        <w:keepLines/>
         <w:spacing w:after="80" w:line="240" w:lineRule="auto"/>
         <w:ind w:left="240" w:hanging="240"/>
         <w:jc w:val="left"/>
@@ -6543,11 +6519,12 @@
           <w:i w:val="0"/>
           <w:sz w:val="16"/>
         </w:rPr>
-        <w:t>[14] OpenPNM, “Valvatne–Blunt hydraulic conductance,” official implementation documentation, installed version 3.6.0. Available: https://openpnm.org/_modules/openpnm/models/physics/hydraulic_conductance/_funcs.html#valvatne_blunt. Accessed Oct. 22, 2026.</w:t>
-      </w:r>
-    </w:p>
-    <w:p>
-      <w:pPr>
+        <w:t>[14] P. Veličković et al., “Graph Attention Networks,” International Conference on Learning Representations, 2018, arXiv:1710.10903.</w:t>
+      </w:r>
+    </w:p>
+    <w:p>
+      <w:pPr>
+        <w:keepLines/>
         <w:spacing w:after="80" w:line="240" w:lineRule="auto"/>
         <w:ind w:left="240" w:hanging="240"/>
         <w:jc w:val="left"/>
@@ -6558,7 +6535,39 @@
           <w:i w:val="0"/>
           <w:sz w:val="16"/>
         </w:rPr>
-        <w:t>[15] S. Nassiri, L. van Paassen and N. Mahabadi, “Evolution of porous media and porosity–permeability relations during biogeochemical clogging processes: A pore-scale simulation study,” Computers and Geotechnics, vol. 198, 108292, 2026, doi: 10.1016/j.compgeo.2026.108292.</w:t>
+        <w:t>[15] J. Sherman and W. J. Morrison, “Adjustment of an inverse matrix corresponding to a change in one element of a given matrix,” The Annals of Mathematical Statistics, vol. 21, no. 1, pp. 124–127, 1950, doi: 10.1214/aoms/1177729893.</w:t>
+      </w:r>
+    </w:p>
+    <w:p>
+      <w:pPr>
+        <w:keepLines/>
+        <w:spacing w:after="80" w:line="240" w:lineRule="auto"/>
+        <w:ind w:left="240" w:hanging="240"/>
+        <w:jc w:val="left"/>
+      </w:pPr>
+      <w:r>
+        <w:rPr>
+          <w:b w:val="0"/>
+          <w:i w:val="0"/>
+          <w:sz w:val="16"/>
+        </w:rPr>
+        <w:t>[16] OpenPNM, “Valvatne–Blunt hydraulic conductance,” official implementation documentation, installed version 3.6.0. Available: https://openpnm.org/_modules/openpnm/models/physics/hydraulic_conductance/_funcs.html#valvatne_blunt. Accessed Oct. 22, 2026.</w:t>
+      </w:r>
+    </w:p>
+    <w:p>
+      <w:pPr>
+        <w:keepLines/>
+        <w:spacing w:after="80" w:line="240" w:lineRule="auto"/>
+        <w:ind w:left="240" w:hanging="240"/>
+        <w:jc w:val="left"/>
+      </w:pPr>
+      <w:r>
+        <w:rPr>
+          <w:b w:val="0"/>
+          <w:i w:val="0"/>
+          <w:sz w:val="16"/>
+        </w:rPr>
+        <w:t>[17] S. Nassiri, L. van Paassen and N. Mahabadi, “Evolution of porous media and porosity–permeability relations during biogeochemical clogging processes: A pore-scale simulation study,” Computers and Geotechnics, vol. 198, 108292, 2026, doi: 10.1016/j.compgeo.2026.108292.</w:t>
       </w:r>
     </w:p>
     <w:p>

</xml_diff>

<commit_message>
Correct manuscript descriptors and confirmed author email
</commit_message>
<xml_diff>
--- a/TopoFlow_IEEE_V4_Cited_Revised.docx
+++ b/TopoFlow_IEEE_V4_Cited_Revised.docx
@@ -28,7 +28,7 @@
           <w:sz w:val="48"/>
           <w:szCs w:val="48"/>
         </w:rPr>
-        <w:t>Permeability Prediction in Micro CT Scans using Graph Attention Networks</w:t>
+        <w:t>Evaluating Physics Guided Graph Attention for Permeability Prediction and Critical Pore Throat Discovery</w:t>
       </w:r>
     </w:p>
     <w:tbl>
@@ -79,7 +79,7 @@
                 <w:sz w:val="20"/>
                 <w:color w:val="000000"/>
               </w:rPr>
-              <w:t>shaunak.rane@universlai.in</w:t>
+              <w:t>shaunak.rane@universalai.in</w:t>
             </w:r>
           </w:p>
         </w:tc>
@@ -4370,7 +4370,7 @@
           <w:sz w:val="20"/>
           <w:lang w:val="en-US"/>
         </w:rPr>
-        <w:t>3) Feature assignment: The ten bulk graph descriptors comprise two porosity transforms, pore log-diameter spread, normalized log-volume mean and spread, log pore and throat counts, and mean, standard deviation and coefficient of variation of degree. Ablations independently enable normalization and this descriptor branch.</w:t>
+        <w:t>3) Feature assignment: The ten raw descriptors are porosity; the mean and population standard deviation of log₁₀ diameter and log₁₀ volume; log₁₀ pore and directed-edge counts; mean and population standard deviation of degree; and pore-radius CV. Each physical throat contributes two directed edges. GAT and physics ridge replace porosity by log₁₀Φ and log₁₀(1−Φ), omit mean log diameter, and subtract 3 log₁₀d₀ from mean log volume, retaining ten inputs. ExtraTrees uses the raw vector. Ablations separately enable node/target scale normalization and this descriptor branch.</w:t>
       </w:r>
     </w:p>
     <w:p>
@@ -5926,7 +5926,7 @@
           <w:i w:val="0"/>
           <w:sz w:val="20"/>
         </w:rPr>
-        <w:t>Partial throat narrowing leaves the original node-only GAT inputs unchanged, so that model returns exactly the same permeability. The edge-aware extension addresses this representation limitation. Guided GAT, guided mean GNN and guided edge MLP share importance supervision with weight 0.05; an unguided GAT is retained as a control. AdamW uses learning rate 0.003, weight decay 0.0001 and batch size two. Development-parent validation selects 15, 12, 22 and seven epochs, respectively; twenty five-seed checkpoints are frozen before the new scans are extracted.</w:t>
+        <w:t>Partial throat narrowing leaves the original node-only GAT inputs unchanged, so that model returns exactly the same permeability. The edge-aware extension addresses this representation limitation. Guided GAT, guided mean GNN and guided edge MLP share importance supervision with weight 0.05; an unguided GAT is retained as a control. AdamW uses learning rate 0.003, weight decay 0.0001 and batch size two. Development-parent validation selects 15, 12, 22 and seven epochs, respectively; 20 checkpoints (four models × five seeds) are frozen before the new scans are extracted.</w:t>
       </w:r>
     </w:p>
     <w:p>

</xml_diff>